<commit_message>
arreglos en las clases: casas,negocios,bombas y proyectil
</commit_message>
<xml_diff>
--- a/Informe_Delivery_Rush.docx
+++ b/Informe_Delivery_Rush.docx
@@ -52,19 +52,7 @@
           <w:sz w:val="22"/>
           <w:shd w:fill="auto" w:val="clear"/>
         </w:rPr>
-        <w:t xml:space="preserve"> PROGRAMACI</w:t>
-      </w:r>
-      <w:r>
-        <w:rPr>
-          <w:rFonts w:ascii="Arial" w:hAnsi="Arial" w:cs="Arial" w:eastAsia="Arial"/>
-          <w:b/>
-          <w:color w:val="auto"/>
-          <w:spacing w:val="0"/>
-          <w:position w:val="0"/>
-          <w:sz w:val="22"/>
-          <w:shd w:fill="auto" w:val="clear"/>
-        </w:rPr>
-        <w:t xml:space="preserve">ÓN I</w:t>
+        <w:t xml:space="preserve"> PROGRAMACIÓN I</w:t>
         <w:br/>
       </w:r>
       <w:r>
@@ -1597,6 +1585,59 @@
     </w:p>
     <w:p>
       <w:pPr>
+        <w:spacing w:before="0" w:after="200" w:line="276"/>
+        <w:ind w:right="0" w:left="0" w:firstLine="0"/>
+        <w:jc w:val="left"/>
+        <w:rPr>
+          <w:rFonts w:ascii="Arial" w:hAnsi="Arial" w:cs="Arial" w:eastAsia="Arial"/>
+          <w:color w:val="auto"/>
+          <w:spacing w:val="0"/>
+          <w:position w:val="0"/>
+          <w:sz w:val="22"/>
+          <w:shd w:fill="auto" w:val="clear"/>
+        </w:rPr>
+      </w:pPr>
+      <w:r>
+        <w:rPr>
+          <w:rFonts w:ascii="Calibri" w:hAnsi="Calibri" w:cs="Calibri" w:eastAsia="Calibri"/>
+          <w:b/>
+          <w:color w:val="4F81BD"/>
+          <w:spacing w:val="0"/>
+          <w:position w:val="0"/>
+          <w:sz w:val="24"/>
+          <w:shd w:fill="auto" w:val="clear"/>
+        </w:rPr>
+        <w:t xml:space="preserve">5.4 Colisiones de casas y negocios</w:t>
+      </w:r>
+    </w:p>
+    <w:p>
+      <w:pPr>
+        <w:spacing w:before="0" w:after="200" w:line="276"/>
+        <w:ind w:right="0" w:left="0" w:firstLine="0"/>
+        <w:jc w:val="left"/>
+        <w:rPr>
+          <w:rFonts w:ascii="Arial" w:hAnsi="Arial" w:cs="Arial" w:eastAsia="Arial"/>
+          <w:color w:val="auto"/>
+          <w:spacing w:val="0"/>
+          <w:position w:val="0"/>
+          <w:sz w:val="22"/>
+          <w:shd w:fill="auto" w:val="clear"/>
+        </w:rPr>
+      </w:pPr>
+      <w:r>
+        <w:rPr>
+          <w:rFonts w:ascii="Arial" w:hAnsi="Arial" w:cs="Arial" w:eastAsia="Arial"/>
+          <w:color w:val="auto"/>
+          <w:spacing w:val="0"/>
+          <w:position w:val="0"/>
+          <w:sz w:val="22"/>
+          <w:shd w:fill="auto" w:val="clear"/>
+        </w:rPr>
+        <w:t xml:space="preserve">Hubo problemas a la hora de hacer la colision del jugador con los edificios, al principio se realizaba la colision con la imagen de las casas y negocios, algo que no deberia funcionar asi, Simplemente se creo el objeto detras de la imagen para que el jugador colisione con el objeto en si y no la imagen.</w:t>
+      </w:r>
+    </w:p>
+    <w:p>
+      <w:pPr>
         <w:keepNext w:val="true"/>
         <w:keepLines w:val="true"/>
         <w:spacing w:before="480" w:after="0" w:line="276"/>
@@ -1623,39 +1664,6 @@
           <w:shd w:fill="auto" w:val="clear"/>
         </w:rPr>
         <w:t xml:space="preserve">6. Pruebas realizadas</w:t>
-      </w:r>
-    </w:p>
-    <w:p>
-      <w:pPr>
-        <w:numPr>
-          <w:ilvl w:val="0"/>
-          <w:numId w:val="45"/>
-        </w:numPr>
-        <w:tabs>
-          <w:tab w:val="left" w:pos="360" w:leader="none"/>
-        </w:tabs>
-        <w:spacing w:before="0" w:after="200" w:line="276"/>
-        <w:ind w:right="0" w:left="360" w:hanging="360"/>
-        <w:jc w:val="left"/>
-        <w:rPr>
-          <w:rFonts w:ascii="Arial" w:hAnsi="Arial" w:cs="Arial" w:eastAsia="Arial"/>
-          <w:color w:val="auto"/>
-          <w:spacing w:val="0"/>
-          <w:position w:val="0"/>
-          <w:sz w:val="22"/>
-          <w:shd w:fill="auto" w:val="clear"/>
-        </w:rPr>
-      </w:pPr>
-      <w:r>
-        <w:rPr>
-          <w:rFonts w:ascii="Arial" w:hAnsi="Arial" w:cs="Arial" w:eastAsia="Arial"/>
-          <w:color w:val="auto"/>
-          <w:spacing w:val="0"/>
-          <w:position w:val="0"/>
-          <w:sz w:val="22"/>
-          <w:shd w:fill="auto" w:val="clear"/>
-        </w:rPr>
-        <w:t xml:space="preserve">Movimiento del jugador por las calles.</w:t>
       </w:r>
     </w:p>
     <w:p>

</xml_diff>